<commit_message>
Docs: capture-phase modifier-click for doc links (ProseMirror swallowed bubbling clicks); demo docx TCs within fixture durations
Chain live-verified: renderer window.open -> docs gate -> openExternal -> AOF Footage Review received open-url and seeked (fixture-h264.mp4 tc=00:00:18:00).

Co-Authored-By: Claude Fable 5 <noreply@anthropic.com>
</commit_message>
<xml_diff>
--- a/apps/docs/fixtures/aof-footage-log-example.docx
+++ b/apps/docs/fixtures/aof-footage-log-example.docx
@@ -15,11 +15,11 @@
         <w:rPr>
           <w:b/>
         </w:rPr>
-        <w:t xml:space="preserve">00:00:18:00 — </w:t>
+        <w:t xml:space="preserve">00:00:00:12 — </w:t>
       </w:r>
       <w:r>
         <w:rPr/>
-        <w:t xml:space="preserve">Dealer: “Shuffle up and deal.”</w:t>
+        <w:t xml:space="preserve">Dealer: “Shuffle up and deal.” Clean soundbite.</w:t>
       </w:r>
     </w:p>
     <w:p>
@@ -29,7 +29,7 @@
             <w:color w:val="1B66D1"/>
             <w:u w:val="single"/>
           </w:rPr>
-          <w:t>Watch 00:00:18:00</w:t>
+          <w:t>Watch 00:00:00:12</w:t>
         </w:r>
       </w:hyperlink>
     </w:p>
@@ -38,7 +38,7 @@
         <w:rPr>
           <w:b/>
         </w:rPr>
-        <w:t xml:space="preserve">00:01:17:00 — </w:t>
+        <w:t xml:space="preserve">00:00:01:06 — </w:t>
       </w:r>
       <w:r>
         <w:rPr/>
@@ -52,7 +52,7 @@
             <w:color w:val="1B66D1"/>
             <w:u w:val="single"/>
           </w:rPr>
-          <w:t>Watch 00:01:17:00</w:t>
+          <w:t>Watch 00:00:01:06</w:t>
         </w:r>
       </w:hyperlink>
     </w:p>
@@ -61,11 +61,11 @@
         <w:rPr>
           <w:b/>
         </w:rPr>
-        <w:t xml:space="preserve">00:00:04:12 — </w:t>
+        <w:t xml:space="preserve">00:00:00:18 — </w:t>
       </w:r>
       <w:r>
         <w:rPr/>
-        <w:t xml:space="preserve">Clean soundbite over ProRes b-roll.</w:t>
+        <w:t xml:space="preserve">ProRes b-roll: gradient sweep left-to-right, sharpest frame.</w:t>
       </w:r>
     </w:p>
     <w:p>
@@ -75,7 +75,7 @@
             <w:color w:val="1B66D1"/>
             <w:u w:val="single"/>
           </w:rPr>
-          <w:t>Watch 00:00:04:12</w:t>
+          <w:t>Watch 00:00:00:18</w:t>
         </w:r>
       </w:hyperlink>
     </w:p>

</xml_diff>